<commit_message>
User Guide 3.4 as accepted, and 3.3 archived
Glen accepted all three tracked insertions and saved without incrementing, so
3.4 is the accepted version rather than a marked-up draft: zero revisions, 12
inline shapes, 11 pages. Committed as it stands.

3.3 moves to Documents\.Archive and to the Dropbox folder's Archive, and 3.4
is published to Sangala Mosaic Files. Hashes compared after the copy.

Section 4, Remove the background, stays without a figure by his decision.

Co-Authored-By: Claude Opus 5 <noreply@anthropic.com>
</commit_message>
<xml_diff>
--- a/Documents/User Guide (Ver 3.4).docx
+++ b/Documents/User Guide (Ver 3.4).docx
@@ -2309,14 +2309,7 @@
           <w:i/>
           <w:iCs/>
         </w:rPr>
-        <w:t>Figure 3.</w:t>
-      </w:r>
-      <w:r>
-        <w:rPr>
-          <w:i/>
-          <w:iCs/>
-        </w:rPr>
-        <w:t xml:space="preserve"> A photo positioned under the grid — whatever falls inside the frame becomes the mosaic.</w:t>
+        <w:t>Figure 3. A photo positioned under the grid — whatever falls inside the frame becomes the mosaic.</w:t>
       </w:r>
     </w:p>
     <w:p>
@@ -2629,14 +2622,7 @@
           <w:i/>
           <w:iCs/>
         </w:rPr>
-        <w:t>Figure 4.</w:t>
-      </w:r>
-      <w:r>
-        <w:rPr>
-          <w:i/>
-          <w:iCs/>
-        </w:rPr>
-        <w:t xml:space="preserve"> The finished mosaic on its baseplate.</w:t>
+        <w:t>Figure 4. The finished mosaic on its baseplate.</w:t>
       </w:r>
     </w:p>
     <w:p>
@@ -2903,14 +2889,7 @@
           <w:i/>
           <w:iCs/>
         </w:rPr>
-        <w:t>Figure 5.</w:t>
-      </w:r>
-      <w:r>
-        <w:rPr>
-          <w:i/>
-          <w:iCs/>
-        </w:rPr>
-        <w:t xml:space="preserve"> The same drawing averaged, and with Sample as line art on.</w:t>
+        <w:t>Figure 5. The same drawing averaged, and with Sample as line art on.</w:t>
       </w:r>
     </w:p>
     <w:p>
@@ -2979,14 +2958,7 @@
           <w:i/>
           <w:iCs/>
         </w:rPr>
-        <w:t>Figure 6.</w:t>
-      </w:r>
-      <w:r>
-        <w:rPr>
-          <w:i/>
-          <w:iCs/>
-        </w:rPr>
-        <w:t xml:space="preserve"> A drawing rendered as dots, beside its source.</w:t>
+        <w:t>Figure 6. A drawing rendered as dots, beside its source.</w:t>
       </w:r>
     </w:p>
     <w:p>
@@ -3411,14 +3383,7 @@
           <w:i/>
           <w:iCs/>
         </w:rPr>
-        <w:t>Figure 8.</w:t>
-      </w:r>
-      <w:r>
-        <w:rPr>
-          <w:i/>
-          <w:iCs/>
-        </w:rPr>
-        <w:t xml:space="preserve"> Transparent makes the tiles translucent so the photo shows through.</w:t>
+        <w:t>Figure 8. Transparent makes the tiles translucent so the photo shows through.</w:t>
       </w:r>
     </w:p>
     <w:p>
@@ -3570,70 +3535,60 @@
         <w:keepNext/>
         <w:spacing w:before="120"/>
         <w:jc w:val="center"/>
-        <w:rPr>
-          <w:ins w:id="4500" w:author="Figures" w:date="2026-08-10T00:00:00Z"/>
-        </w:rPr>
-      </w:pPr>
-      <w:ins w:id="4000" w:author="Figures" w:date="2026-08-10T00:00:00Z">
-        <w:r>
-          <w:rPr>
-            <w:noProof/>
-          </w:rPr>
-          <w:drawing>
-            <wp:inline distT="0" distB="0" distL="0" distR="0">
-              <wp:extent cx="3840480" cy="3761294"/>
-              <wp:effectExtent l="0" t="0" r="0" b="0"/>
-              <wp:docPr id="2100" name="Figure2100"/>
-              <wp:cNvGraphicFramePr>
-                <a:graphicFrameLocks xmlns:a="http://schemas.openxmlformats.org/drawingml/2006/main" noChangeAspect="1"/>
-              </wp:cNvGraphicFramePr>
-              <a:graphic xmlns:a="http://schemas.openxmlformats.org/drawingml/2006/main">
-                <a:graphicData uri="http://schemas.openxmlformats.org/drawingml/2006/picture">
-                  <pic:pic xmlns:pic="http://schemas.openxmlformats.org/drawingml/2006/picture">
-                    <pic:nvPicPr>
-                      <pic:cNvPr id="2100" name="Figure2100.png"/>
-                      <pic:cNvPicPr/>
-                    </pic:nvPicPr>
-                    <pic:blipFill>
-                      <a:blip r:embed="rId21"/>
-                      <a:stretch>
-                        <a:fillRect/>
-                      </a:stretch>
-                    </pic:blipFill>
-                    <pic:spPr>
-                      <a:xfrm>
-                        <a:off x="0" y="0"/>
-                        <a:ext cx="3840480" cy="3761294"/>
-                      </a:xfrm>
-                      <a:prstGeom prst="rect">
-                        <a:avLst/>
-                      </a:prstGeom>
-                    </pic:spPr>
-                  </pic:pic>
-                </a:graphicData>
-              </a:graphic>
-            </wp:inline>
-          </w:drawing>
-        </w:r>
-      </w:ins>
+      </w:pPr>
+      <w:r>
+        <w:rPr>
+          <w:noProof/>
+        </w:rPr>
+        <w:drawing>
+          <wp:inline distT="0" distB="0" distL="0" distR="0" wp14:anchorId="3C6C8A76" wp14:editId="2B08B460">
+            <wp:extent cx="3840480" cy="3761294"/>
+            <wp:effectExtent l="0" t="0" r="0" b="0"/>
+            <wp:docPr id="2100" name="Figure2100"/>
+            <wp:cNvGraphicFramePr>
+              <a:graphicFrameLocks xmlns:a="http://schemas.openxmlformats.org/drawingml/2006/main" noChangeAspect="1"/>
+            </wp:cNvGraphicFramePr>
+            <a:graphic xmlns:a="http://schemas.openxmlformats.org/drawingml/2006/main">
+              <a:graphicData uri="http://schemas.openxmlformats.org/drawingml/2006/picture">
+                <pic:pic xmlns:pic="http://schemas.openxmlformats.org/drawingml/2006/picture">
+                  <pic:nvPicPr>
+                    <pic:cNvPr id="2100" name="Figure2100.png"/>
+                    <pic:cNvPicPr/>
+                  </pic:nvPicPr>
+                  <pic:blipFill>
+                    <a:blip r:embed="rId18"/>
+                    <a:stretch>
+                      <a:fillRect/>
+                    </a:stretch>
+                  </pic:blipFill>
+                  <pic:spPr>
+                    <a:xfrm>
+                      <a:off x="0" y="0"/>
+                      <a:ext cx="3840480" cy="3761294"/>
+                    </a:xfrm>
+                    <a:prstGeom prst="rect">
+                      <a:avLst/>
+                    </a:prstGeom>
+                  </pic:spPr>
+                </pic:pic>
+              </a:graphicData>
+            </a:graphic>
+          </wp:inline>
+        </w:drawing>
+      </w:r>
     </w:p>
     <w:p>
       <w:pPr>
         <w:spacing w:before="60" w:after="120"/>
         <w:jc w:val="center"/>
-        <w:rPr>
-          <w:ins w:id="4505" w:author="Figures" w:date="2026-08-10T00:00:00Z"/>
-        </w:rPr>
-      </w:pPr>
-      <w:ins w:id="4005" w:author="Figures" w:date="2026-08-10T00:00:00Z">
-        <w:r>
-          <w:rPr>
-            <w:i/>
-            <w:iCs/>
-          </w:rPr>
-          <w:t xml:space="preserve">Figure 9. The Paint tool, with a row of tiles painted over the built mosaic by hand.</w:t>
-        </w:r>
-      </w:ins>
+      </w:pPr>
+      <w:r>
+        <w:rPr>
+          <w:i/>
+          <w:iCs/>
+        </w:rPr>
+        <w:t>Figure 9. The Paint tool, with a row of tiles painted over the built mosaic by hand.</w:t>
+      </w:r>
     </w:p>
     <w:p>
       <w:pPr>
@@ -3846,6 +3801,7 @@
         <w:spacing w:before="0" w:beforeAutospacing="0" w:after="60" w:afterAutospacing="0"/>
       </w:pPr>
       <w:r>
+        <w:lastRenderedPageBreak/>
         <w:t>Parts are saved in the project and keep their names when it is reopened.</w:t>
       </w:r>
     </w:p>
@@ -3854,70 +3810,60 @@
         <w:keepNext/>
         <w:spacing w:before="120"/>
         <w:jc w:val="center"/>
-        <w:rPr>
-          <w:ins w:id="4510" w:author="Figures" w:date="2026-08-10T00:00:00Z"/>
-        </w:rPr>
-      </w:pPr>
-      <w:ins w:id="4010" w:author="Figures" w:date="2026-08-10T00:00:00Z">
-        <w:r>
-          <w:rPr>
-            <w:noProof/>
-          </w:rPr>
-          <w:drawing>
-            <wp:inline distT="0" distB="0" distL="0" distR="0">
-              <wp:extent cx="4572000" cy="3026071"/>
-              <wp:effectExtent l="0" t="0" r="0" b="0"/>
-              <wp:docPr id="2101" name="Figure2101"/>
-              <wp:cNvGraphicFramePr>
-                <a:graphicFrameLocks xmlns:a="http://schemas.openxmlformats.org/drawingml/2006/main" noChangeAspect="1"/>
-              </wp:cNvGraphicFramePr>
-              <a:graphic xmlns:a="http://schemas.openxmlformats.org/drawingml/2006/main">
-                <a:graphicData uri="http://schemas.openxmlformats.org/drawingml/2006/picture">
-                  <pic:pic xmlns:pic="http://schemas.openxmlformats.org/drawingml/2006/picture">
-                    <pic:nvPicPr>
-                      <pic:cNvPr id="2101" name="Figure2101.png"/>
-                      <pic:cNvPicPr/>
-                    </pic:nvPicPr>
-                    <pic:blipFill>
-                      <a:blip r:embed="rId22"/>
-                      <a:stretch>
-                        <a:fillRect/>
-                      </a:stretch>
-                    </pic:blipFill>
-                    <pic:spPr>
-                      <a:xfrm>
-                        <a:off x="0" y="0"/>
-                        <a:ext cx="4572000" cy="3026071"/>
-                      </a:xfrm>
-                      <a:prstGeom prst="rect">
-                        <a:avLst/>
-                      </a:prstGeom>
-                    </pic:spPr>
-                  </pic:pic>
-                </a:graphicData>
-              </a:graphic>
-            </wp:inline>
-          </w:drawing>
-        </w:r>
-      </w:ins>
+      </w:pPr>
+      <w:r>
+        <w:rPr>
+          <w:noProof/>
+        </w:rPr>
+        <w:drawing>
+          <wp:inline distT="0" distB="0" distL="0" distR="0" wp14:anchorId="07FC82BF" wp14:editId="7D3091E1">
+            <wp:extent cx="4572000" cy="3026071"/>
+            <wp:effectExtent l="0" t="0" r="0" b="0"/>
+            <wp:docPr id="2101" name="Figure2101"/>
+            <wp:cNvGraphicFramePr>
+              <a:graphicFrameLocks xmlns:a="http://schemas.openxmlformats.org/drawingml/2006/main" noChangeAspect="1"/>
+            </wp:cNvGraphicFramePr>
+            <a:graphic xmlns:a="http://schemas.openxmlformats.org/drawingml/2006/main">
+              <a:graphicData uri="http://schemas.openxmlformats.org/drawingml/2006/picture">
+                <pic:pic xmlns:pic="http://schemas.openxmlformats.org/drawingml/2006/picture">
+                  <pic:nvPicPr>
+                    <pic:cNvPr id="2101" name="Figure2101.png"/>
+                    <pic:cNvPicPr/>
+                  </pic:nvPicPr>
+                  <pic:blipFill>
+                    <a:blip r:embed="rId19"/>
+                    <a:stretch>
+                      <a:fillRect/>
+                    </a:stretch>
+                  </pic:blipFill>
+                  <pic:spPr>
+                    <a:xfrm>
+                      <a:off x="0" y="0"/>
+                      <a:ext cx="4572000" cy="3026071"/>
+                    </a:xfrm>
+                    <a:prstGeom prst="rect">
+                      <a:avLst/>
+                    </a:prstGeom>
+                  </pic:spPr>
+                </pic:pic>
+              </a:graphicData>
+            </a:graphic>
+          </wp:inline>
+        </w:drawing>
+      </w:r>
     </w:p>
     <w:p>
       <w:pPr>
         <w:spacing w:before="60" w:after="120"/>
         <w:jc w:val="center"/>
-        <w:rPr>
-          <w:ins w:id="4515" w:author="Figures" w:date="2026-08-10T00:00:00Z"/>
-        </w:rPr>
-      </w:pPr>
-      <w:ins w:id="4015" w:author="Figures" w:date="2026-08-10T00:00:00Z">
-        <w:r>
-          <w:rPr>
-            <w:i/>
-            <w:iCs/>
-          </w:rPr>
-          <w:t xml:space="preserve">Figure 10. A selection grouped into a part, outlined on the mosaic and listed on the right.</w:t>
-        </w:r>
-      </w:ins>
+      </w:pPr>
+      <w:r>
+        <w:rPr>
+          <w:i/>
+          <w:iCs/>
+        </w:rPr>
+        <w:t>Figure 10. A selection grouped into a part, outlined on the mosaic and listed on the right.</w:t>
+      </w:r>
     </w:p>
     <w:p>
       <w:pPr>
@@ -3949,70 +3895,60 @@
         <w:keepNext/>
         <w:spacing w:before="120"/>
         <w:jc w:val="center"/>
-        <w:rPr>
-          <w:ins w:id="4520" w:author="Figures" w:date="2026-08-10T00:00:00Z"/>
-        </w:rPr>
-      </w:pPr>
-      <w:ins w:id="4020" w:author="Figures" w:date="2026-08-10T00:00:00Z">
-        <w:r>
-          <w:rPr>
-            <w:noProof/>
-          </w:rPr>
-          <w:drawing>
-            <wp:inline distT="0" distB="0" distL="0" distR="0">
-              <wp:extent cx="5486400" cy="1067822"/>
-              <wp:effectExtent l="0" t="0" r="0" b="0"/>
-              <wp:docPr id="2102" name="Figure2102"/>
-              <wp:cNvGraphicFramePr>
-                <a:graphicFrameLocks xmlns:a="http://schemas.openxmlformats.org/drawingml/2006/main" noChangeAspect="1"/>
-              </wp:cNvGraphicFramePr>
-              <a:graphic xmlns:a="http://schemas.openxmlformats.org/drawingml/2006/main">
-                <a:graphicData uri="http://schemas.openxmlformats.org/drawingml/2006/picture">
-                  <pic:pic xmlns:pic="http://schemas.openxmlformats.org/drawingml/2006/picture">
-                    <pic:nvPicPr>
-                      <pic:cNvPr id="2102" name="Figure2102.png"/>
-                      <pic:cNvPicPr/>
-                    </pic:nvPicPr>
-                    <pic:blipFill>
-                      <a:blip r:embed="rId23"/>
-                      <a:stretch>
-                        <a:fillRect/>
-                      </a:stretch>
-                    </pic:blipFill>
-                    <pic:spPr>
-                      <a:xfrm>
-                        <a:off x="0" y="0"/>
-                        <a:ext cx="5486400" cy="1067822"/>
-                      </a:xfrm>
-                      <a:prstGeom prst="rect">
-                        <a:avLst/>
-                      </a:prstGeom>
-                    </pic:spPr>
-                  </pic:pic>
-                </a:graphicData>
-              </a:graphic>
-            </wp:inline>
-          </w:drawing>
-        </w:r>
-      </w:ins>
+      </w:pPr>
+      <w:r>
+        <w:rPr>
+          <w:noProof/>
+        </w:rPr>
+        <w:drawing>
+          <wp:inline distT="0" distB="0" distL="0" distR="0" wp14:anchorId="4B59634B" wp14:editId="3F430625">
+            <wp:extent cx="5486400" cy="1067822"/>
+            <wp:effectExtent l="0" t="0" r="0" b="0"/>
+            <wp:docPr id="2102" name="Figure2102"/>
+            <wp:cNvGraphicFramePr>
+              <a:graphicFrameLocks xmlns:a="http://schemas.openxmlformats.org/drawingml/2006/main" noChangeAspect="1"/>
+            </wp:cNvGraphicFramePr>
+            <a:graphic xmlns:a="http://schemas.openxmlformats.org/drawingml/2006/main">
+              <a:graphicData uri="http://schemas.openxmlformats.org/drawingml/2006/picture">
+                <pic:pic xmlns:pic="http://schemas.openxmlformats.org/drawingml/2006/picture">
+                  <pic:nvPicPr>
+                    <pic:cNvPr id="2102" name="Figure2102.png"/>
+                    <pic:cNvPicPr/>
+                  </pic:nvPicPr>
+                  <pic:blipFill>
+                    <a:blip r:embed="rId20"/>
+                    <a:stretch>
+                      <a:fillRect/>
+                    </a:stretch>
+                  </pic:blipFill>
+                  <pic:spPr>
+                    <a:xfrm>
+                      <a:off x="0" y="0"/>
+                      <a:ext cx="5486400" cy="1067822"/>
+                    </a:xfrm>
+                    <a:prstGeom prst="rect">
+                      <a:avLst/>
+                    </a:prstGeom>
+                  </pic:spPr>
+                </pic:pic>
+              </a:graphicData>
+            </a:graphic>
+          </wp:inline>
+        </w:drawing>
+      </w:r>
     </w:p>
     <w:p>
       <w:pPr>
         <w:spacing w:before="60" w:after="120"/>
         <w:jc w:val="center"/>
-        <w:rPr>
-          <w:ins w:id="4525" w:author="Figures" w:date="2026-08-10T00:00:00Z"/>
-        </w:rPr>
-      </w:pPr>
-      <w:ins w:id="4025" w:author="Figures" w:date="2026-08-10T00:00:00Z">
-        <w:r>
-          <w:rPr>
-            <w:i/>
-            <w:iCs/>
-          </w:rPr>
-          <w:t xml:space="preserve">Figure 11. The tile list beneath the printed sheet: every color with the number of tiles the design uses.</w:t>
-        </w:r>
-      </w:ins>
+      </w:pPr>
+      <w:r>
+        <w:rPr>
+          <w:i/>
+          <w:iCs/>
+        </w:rPr>
+        <w:t>Figure 11. The tile list beneath the printed sheet: every color with the number of tiles the design uses.</w:t>
+      </w:r>
     </w:p>
     <w:p>
       <w:pPr>
@@ -6069,7 +6005,7 @@
       </w:pPr>
     </w:p>
     <w:sectPr>
-      <w:footerReference w:type="default" r:id="rId18"/>
+      <w:footerReference w:type="default" r:id="rId21"/>
       <w:pgSz w:w="12240" w:h="15840"/>
       <w:pgMar w:top="1440" w:right="1530" w:bottom="1440" w:left="1440" w:header="720" w:footer="720" w:gutter="0"/>
       <w:pgNumType w:start="1"/>

</xml_diff>